<commit_message>
Adjust heatmap comment with correct location
</commit_message>
<xml_diff>
--- a/MLDP Program Codes Submission Declaration.docx
+++ b/MLDP Program Codes Submission Declaration.docx
@@ -1628,6 +1628,7 @@
           <w:rFonts w:ascii="Arial" w:hAnsi="Arial" w:cs="Arial"/>
           <w:b/>
           <w:bCs/>
+          <w:u w:val="single"/>
         </w:rPr>
       </w:pPr>
       <w:r>
@@ -1680,22 +1681,14 @@
           <w:rFonts w:ascii="Arial" w:hAnsi="Arial" w:cs="Arial"/>
           <w:b/>
           <w:bCs/>
-        </w:rPr>
-      </w:pPr>
-    </w:p>
-    <w:p>
-      <w:pPr>
+          <w:u w:val="single"/>
+        </w:rPr>
+      </w:pPr>
+      <w:r>
         <w:rPr>
           <w:rFonts w:ascii="Arial" w:hAnsi="Arial" w:cs="Arial"/>
           <w:b/>
           <w:bCs/>
-        </w:rPr>
-      </w:pPr>
-      <w:r>
-        <w:rPr>
-          <w:rFonts w:ascii="Arial" w:hAnsi="Arial" w:cs="Arial"/>
-          <w:b/>
-          <w:bCs/>
           <w:u w:val="single"/>
         </w:rPr>
         <w:t>Screenshots of version control or development logs (if applicable)</w:t>
@@ -1704,30 +1697,19 @@
     <w:p>
       <w:pPr>
         <w:rPr>
-          <w:rFonts w:ascii="Arial" w:hAnsi="Arial" w:cs="Arial"/>
-          <w:b/>
-          <w:bCs/>
-          <w:u w:val="single"/>
-        </w:rPr>
-      </w:pPr>
-    </w:p>
-    <w:p>
-      <w:pPr>
-        <w:rPr>
-          <w:rFonts w:ascii="Arial Nova" w:hAnsi="Arial Nova"/>
-        </w:rPr>
-      </w:pPr>
-      <w:r>
-        <w:rPr>
-          <w:rFonts w:ascii="Arial Nova" w:hAnsi="Arial Nova"/>
-          <w:noProof/>
+          <w:rFonts w:ascii="Arial Nova" w:hAnsi="Arial Nova"/>
+        </w:rPr>
+      </w:pPr>
+      <w:r>
+        <w:rPr>
+          <w:rFonts w:ascii="Arial Nova" w:hAnsi="Arial Nova"/>
         </w:rPr>
         <w:lastRenderedPageBreak/>
         <w:drawing>
-          <wp:inline distT="0" distB="0" distL="0" distR="0" wp14:anchorId="76CF8D17" wp14:editId="46FFB98D">
-            <wp:extent cx="4596449" cy="3484257"/>
-            <wp:effectExtent l="0" t="0" r="0" b="1905"/>
-            <wp:docPr id="646426512" name="Picture 1"/>
+          <wp:inline distT="0" distB="0" distL="0" distR="0" wp14:anchorId="0B772192" wp14:editId="25BBE808">
+            <wp:extent cx="4020190" cy="3451412"/>
+            <wp:effectExtent l="0" t="0" r="0" b="0"/>
+            <wp:docPr id="1468818525" name="Picture 1"/>
             <wp:cNvGraphicFramePr>
               <a:graphicFrameLocks xmlns:a="http://schemas.openxmlformats.org/drawingml/2006/main" noChangeAspect="1"/>
             </wp:cNvGraphicFramePr>
@@ -1735,7 +1717,7 @@
               <a:graphicData uri="http://schemas.openxmlformats.org/drawingml/2006/picture">
                 <pic:pic xmlns:pic="http://schemas.openxmlformats.org/drawingml/2006/picture">
                   <pic:nvPicPr>
-                    <pic:cNvPr id="646426512" name=""/>
+                    <pic:cNvPr id="1468818525" name=""/>
                     <pic:cNvPicPr/>
                   </pic:nvPicPr>
                   <pic:blipFill>
@@ -1747,7 +1729,7 @@
                   <pic:spPr>
                     <a:xfrm>
                       <a:off x="0" y="0"/>
-                      <a:ext cx="4597973" cy="3485412"/>
+                      <a:ext cx="4024210" cy="3454863"/>
                     </a:xfrm>
                     <a:prstGeom prst="rect">
                       <a:avLst/>
@@ -1769,13 +1751,12 @@
       <w:r>
         <w:rPr>
           <w:rFonts w:ascii="Arial Nova" w:hAnsi="Arial Nova"/>
-          <w:noProof/>
         </w:rPr>
         <w:drawing>
-          <wp:inline distT="0" distB="0" distL="0" distR="0" wp14:anchorId="0391B8AD" wp14:editId="623D81F2">
-            <wp:extent cx="4596130" cy="3359258"/>
-            <wp:effectExtent l="0" t="0" r="0" b="0"/>
-            <wp:docPr id="278095616" name="Picture 1"/>
+          <wp:inline distT="0" distB="0" distL="0" distR="0" wp14:anchorId="4758CE2E" wp14:editId="1BC7EEF6">
+            <wp:extent cx="4020185" cy="3445171"/>
+            <wp:effectExtent l="0" t="0" r="0" b="3175"/>
+            <wp:docPr id="1509068647" name="Picture 1"/>
             <wp:cNvGraphicFramePr>
               <a:graphicFrameLocks xmlns:a="http://schemas.openxmlformats.org/drawingml/2006/main" noChangeAspect="1"/>
             </wp:cNvGraphicFramePr>
@@ -1783,7 +1764,7 @@
               <a:graphicData uri="http://schemas.openxmlformats.org/drawingml/2006/picture">
                 <pic:pic xmlns:pic="http://schemas.openxmlformats.org/drawingml/2006/picture">
                   <pic:nvPicPr>
-                    <pic:cNvPr id="278095616" name=""/>
+                    <pic:cNvPr id="1509068647" name=""/>
                     <pic:cNvPicPr/>
                   </pic:nvPicPr>
                   <pic:blipFill>
@@ -1795,7 +1776,7 @@
                   <pic:spPr>
                     <a:xfrm>
                       <a:off x="0" y="0"/>
-                      <a:ext cx="4607259" cy="3367392"/>
+                      <a:ext cx="4057269" cy="3476951"/>
                     </a:xfrm>
                     <a:prstGeom prst="rect">
                       <a:avLst/>
@@ -1817,13 +1798,12 @@
       <w:r>
         <w:rPr>
           <w:rFonts w:ascii="Arial Nova" w:hAnsi="Arial Nova"/>
-          <w:noProof/>
         </w:rPr>
         <w:drawing>
-          <wp:inline distT="0" distB="0" distL="0" distR="0" wp14:anchorId="1CBB1F56" wp14:editId="70B63E05">
-            <wp:extent cx="4604382" cy="1404882"/>
-            <wp:effectExtent l="0" t="0" r="6350" b="5080"/>
-            <wp:docPr id="2143353831" name="Picture 1"/>
+          <wp:inline distT="0" distB="0" distL="0" distR="0" wp14:anchorId="4449F404" wp14:editId="0B435E17">
+            <wp:extent cx="4020185" cy="1452896"/>
+            <wp:effectExtent l="0" t="0" r="0" b="0"/>
+            <wp:docPr id="1600407680" name="Picture 1"/>
             <wp:cNvGraphicFramePr>
               <a:graphicFrameLocks xmlns:a="http://schemas.openxmlformats.org/drawingml/2006/main" noChangeAspect="1"/>
             </wp:cNvGraphicFramePr>
@@ -1831,7 +1811,7 @@
               <a:graphicData uri="http://schemas.openxmlformats.org/drawingml/2006/picture">
                 <pic:pic xmlns:pic="http://schemas.openxmlformats.org/drawingml/2006/picture">
                   <pic:nvPicPr>
-                    <pic:cNvPr id="2143353831" name=""/>
+                    <pic:cNvPr id="1600407680" name=""/>
                     <pic:cNvPicPr/>
                   </pic:nvPicPr>
                   <pic:blipFill>
@@ -1843,7 +1823,7 @@
                   <pic:spPr>
                     <a:xfrm>
                       <a:off x="0" y="0"/>
-                      <a:ext cx="4635523" cy="1414384"/>
+                      <a:ext cx="4044759" cy="1461777"/>
                     </a:xfrm>
                     <a:prstGeom prst="rect">
                       <a:avLst/>

</xml_diff>